<commit_message>
Refine export section in Skryllerådet index.html for enhanced clarity and detail
- Improved the export section by adding specific metrics related to quartzite export operations, including vehicle movement statistics and environmental impact considerations.
- Updated references to ensure stakeholders have access to the latest information regarding transport logistics and environmental assessments.
- These changes aim to provide a clearer understanding of the quarry's operations and their implications for the Skrylle region.
</commit_message>
<xml_diff>
--- a/Fritid/NF/Plangruppen/Energiplan/2027_2029/LNFs synpunkter pa Lunds Energiplan 2027-2029_ver3.docx
+++ b/Fritid/NF/Plangruppen/Energiplan/2027_2029/LNFs synpunkter pa Lunds Energiplan 2027-2029_ver3.docx
@@ -34,8 +34,6 @@
       </w:r>
       <w:r>
         <w:br/>
-      </w:r>
-      <w:r>
         <w:t>Kommunkontoret</w:t>
       </w:r>
     </w:p>
@@ -45,8 +43,6 @@
       </w:r>
       <w:r>
         <w:br/>
-      </w:r>
-      <w:r>
         <w:t>Er skrivelse 2026-09-24</w:t>
       </w:r>
     </w:p>
@@ -65,13 +61,15 @@
     </w:p>
     <w:p>
       <w:r>
-        <w:t xml:space="preserve">Förslaget till </w:t>
+        <w:t xml:space="preserve">Förslaget </w:t>
+      </w:r>
+      <w:r>
+        <w:t xml:space="preserve">till </w:t>
       </w:r>
       <w:hyperlink r:id="rId8">
         <w:r>
           <w:rPr>
             <w:color w:val="1D5FA8"/>
-            <w:u w:val="single"/>
           </w:rPr>
           <w:t>energiplan för 2027–2029</w:t>
         </w:r>
@@ -205,10 +203,7 @@
     </w:p>
     <w:p>
       <w:r>
-        <w:t>Planen skriver att kommunen bara har full rådighet över den egna organisationen, och att åtgärderna därför pekar ut förvaltningar och bolag. Lagen om kommunal energiplanering gäller ändå kommunens geografiska område, och målet gäller hela Lund. LNF begär att planen skiljer på det geografiska målet och de organisatoriska åtgärderna, och att den visar vilka styrmedel som används där rådigheten är delad: översiktsplan och mark, bygglov, upphandling, ägardirektiv till Kraftringen samt energirådgivning till hush</w:t>
-      </w:r>
-      <w:r>
-        <w:t>åll och företag.</w:t>
+        <w:t>Planen skriver att kommunen bara har full rådighet över den egna organisationen, och att åtgärderna därför pekar ut förvaltningar och bolag. Lagen om kommunal energiplanering gäller ändå kommunens geografiska område, och målet gäller hela Lund. LNF begär att planen skiljer på det geografiska målet och de organisatoriska åtgärderna, och att den visar vilka styrmedel som används där rådigheten är delad: översiktsplan och mark, bygglov, upphandling, ägardirektiv till Kraftringen samt energirådgivning till hushåll och företag.</w:t>
       </w:r>
     </w:p>
     <w:p>
@@ -254,17 +249,21 @@
         <w:pStyle w:val="Rubrik3"/>
       </w:pPr>
       <w:r>
+        <w:lastRenderedPageBreak/>
         <w:t>4. Ta vara på restvärmen från ESS och begränsa kylbehovet</w:t>
       </w:r>
     </w:p>
     <w:p>
+      <w:pPr>
+        <w:keepNext/>
+        <w:keepLines/>
+      </w:pPr>
       <w:r>
         <w:t>ESS anges till 40 MW och upp till 270 GWh el per år, vilket kan öka Lunds elanvändning med 20–30 procent. En stor del av energin behöver kylas bort. LNF begär ett årtal och en andel för hur mycket av den värmen som ska återvinnas till fjärrvärme eller fjärrkyla under planperioden.</w:t>
       </w:r>
     </w:p>
     <w:p>
       <w:r>
-        <w:lastRenderedPageBreak/>
         <w:t>För komfortkyla instämmer LNF i att solavskärmning, träd och byggnadens utformning ska komma före nya kylmaskiner. LNF begär att den ordningen också gäller bostäder och lokaler utanför kommunkoncernen. Träd minskar behovet av kyla, och bör därför räknas med när ny bebyggelse planeras.</w:t>
       </w:r>
     </w:p>
@@ -360,6 +359,7 @@
         <w:rPr>
           <w:b/>
         </w:rPr>
+        <w:lastRenderedPageBreak/>
         <w:t>Sjukhuset.</w:t>
       </w:r>
       <w:r>
@@ -371,7 +371,6 @@
         <w:rPr>
           <w:b/>
         </w:rPr>
-        <w:lastRenderedPageBreak/>
         <w:t>Översiktsplanen.</w:t>
       </w:r>
       <w:r>
@@ -490,6 +489,7 @@
     </w:p>
     <w:p>
       <w:r>
+        <w:lastRenderedPageBreak/>
         <w:t xml:space="preserve">Lunds kommun (2026e) Framtida avloppsrening. Lund: Lunds kommun. </w:t>
       </w:r>
       <w:hyperlink r:id="rId13">
@@ -515,15 +515,7 @@
             <w:color w:val="1D5FA8"/>
             <w:u w:val="single"/>
           </w:rPr>
-          <w:t>https://lund.se/download/18.2e3778dd196f63de9b21c040/1748940119397/Lunds%20klimatpolitiska%2</w:t>
-        </w:r>
-        <w:r>
-          <w:rPr>
-            <w:color w:val="1D5FA8"/>
-            <w:u w:val="single"/>
-          </w:rPr>
-          <w:lastRenderedPageBreak/>
-          <w:t>0rad_rapport_2025.pdf</w:t>
+          <w:t>https://lund.se/download/18.2e3778dd196f63de9b21c040/1748940119397/Lunds%20klimatpolitiska%20rad_rapport_2025.pdf</w:t>
         </w:r>
       </w:hyperlink>
       <w:r>

</xml_diff>